<commit_message>
Say what asyncio did: wait for ESP32 and server messages concurrently
- CVs, Word copies and LinkedIn.md: asyncio waits for messages from the
  ESP32 (serial) and the server at the same time, cutting CPU use and
  latency by about 40%
- facts.md and talking guide story 3.3 explain it with this example
- '40%' no longer bold, so a wrapped line can't start with bold text
  (the ATS parser read that as a new job)
</commit_message>
<xml_diff>
--- a/Career-Roadmap/CV/cv-general-swe.docx
+++ b/Career-Roadmap/CV/cv-general-swe.docx
@@ -302,7 +302,7 @@
           <w:color w:val="4A5568"/>
           <w:sz w:val="19"/>
         </w:rPr>
-        <w:t xml:space="preserve">Google Summer of Code (GSoC) 2026: Printers page for COSMIC Settings, in Rust; passed the final evaluation, still maintaining it  |  </w:t>
+        <w:t xml:space="preserve">GSoC 2026: Printers page for COSMIC Settings, in Rust; passed the final evaluation  |  </w:t>
       </w:r>
       <w:hyperlink r:id="rId12">
         <w:r>
@@ -357,7 +357,7 @@
           <w:i w:val="0"/>
           <w:sz w:val="20"/>
         </w:rPr>
-        <w:t xml:space="preserve"> and a standalone app sharing the same UI: printers grouped by device, status and supply levels, print queues, live updates, and an Add Printer flow for legacy printers (</w:t>
+        <w:t xml:space="preserve"> and a standalone app with the same UI: printers grouped by device, status and supply levels, print queues, live updates, and an Add Printer flow for legacy printers (</w:t>
       </w:r>
       <w:hyperlink r:id="rId13">
         <w:r>
@@ -568,25 +568,7 @@
           <w:i w:val="0"/>
           <w:sz w:val="20"/>
         </w:rPr>
-        <w:t xml:space="preserve">Built the PyQt5 control app; asyncio and background threads cut CPU use and latency by </w:t>
-      </w:r>
-      <w:r>
-        <w:rPr>
-          <w:rFonts w:ascii="Calibri" w:hAnsi="Calibri"/>
-          <w:b/>
-          <w:i w:val="0"/>
-          <w:sz w:val="20"/>
-        </w:rPr>
-        <w:t>about 40%</w:t>
-      </w:r>
-      <w:r>
-        <w:rPr>
-          <w:rFonts w:ascii="Calibri" w:hAnsi="Calibri"/>
-          <w:b w:val="0"/>
-          <w:i w:val="0"/>
-          <w:sz w:val="20"/>
-        </w:rPr>
-        <w:t xml:space="preserve"> (measured).</w:t>
+        <w:t>Built the PyQt5 control app; used asyncio to wait for ESP32 and server messages concurrently, cutting CPU use and latency by about 40% (measured).</w:t>
       </w:r>
     </w:p>
     <w:p>

</xml_diff>